<commit_message>
Update config verification screenshots and report
</commit_message>
<xml_diff>
--- a/docs/软件服务工程大作业报告-饿了么外卖平台.docx
+++ b/docs/软件服务工程大作业报告-饿了么外卖平台.docx
@@ -6397,7 +6397,7 @@
       <w:r>
         <w:drawing>
           <wp:inline xmlns:a="http://schemas.openxmlformats.org/drawingml/2006/main" xmlns:pic="http://schemas.openxmlformats.org/drawingml/2006/picture">
-            <wp:extent cx="5220000" cy="3670312"/>
+            <wp:extent cx="5221224" cy="1147521"/>
             <wp:docPr id="14" name="Picture 14"/>
             <wp:cNvGraphicFramePr>
               <a:graphicFrameLocks noChangeAspect="1"/>
@@ -6418,7 +6418,7 @@
                   <pic:spPr>
                     <a:xfrm>
                       <a:off x="0" y="0"/>
-                      <a:ext cx="5220000" cy="3670312"/>
+                      <a:ext cx="5221224" cy="1147521"/>
                     </a:xfrm>
                     <a:prstGeom prst="rect"/>
                   </pic:spPr>
@@ -6438,10 +6438,9 @@
       <w:r>
         <w:rPr>
           <w:rFonts w:ascii="Times New Roman" w:hAnsi="Times New Roman" w:eastAsia="宋体"/>
-          <w:b w:val="0"/>
-          <w:sz w:val="21"/>
+          <w:sz w:val="24"/>
         </w:rPr>
-        <w:t>图4.11  Config Server 读取 business-service 配置截图</w:t>
+        <w:t>图4.11  Config Server 从 GitHub 读取 business-service 配置截图</w:t>
       </w:r>
     </w:p>
     <w:p>
@@ -8886,9 +8885,9 @@
     <w:tbl>
       <w:tblPr>
         <w:tblW w:type="auto" w:w="0"/>
-        <w:jc w:val="center"/>
         <w:tblLayout w:type="fixed"/>
         <w:tblLook w:firstColumn="1" w:firstRow="1" w:lastColumn="0" w:lastRow="0" w:noHBand="0" w:noVBand="1" w:val="04A0"/>
+        <w:jc w:val="center"/>
         <w:tblBorders>
           <w:top w:val="single" w:sz="4" w:space="0" w:color="808080"/>
           <w:left w:val="single" w:sz="4" w:space="0" w:color="808080"/>
@@ -8905,9 +8904,10 @@
         <w:gridCol w:w="2239"/>
       </w:tblGrid>
       <w:tr>
+        <w:trPr/>
         <w:tc>
           <w:tcPr>
-            <w:tcW w:type="dxa" w:w="3401"/>
+            <w:tcW w:type="dxa" w:w="4032"/>
             <w:vAlign w:val="center"/>
             <w:shd w:fill="F2F2F2"/>
           </w:tcPr>
@@ -8916,12 +8916,17 @@
               <w:spacing w:before="0" w:after="0" w:line="240" w:lineRule="auto"/>
               <w:jc w:val="center"/>
             </w:pPr>
-            <w:r/>
+            <w:r>
+              <w:rPr>
+                <w:rFonts w:ascii="Times New Roman" w:hAnsi="Times New Roman" w:eastAsia="宋体"/>
+                <w:sz w:val="20"/>
+              </w:rPr>
+            </w:r>
             <w:r>
               <w:rPr>
                 <w:rFonts w:ascii="Times New Roman" w:hAnsi="Times New Roman" w:eastAsia="宋体"/>
                 <w:b/>
-                <w:sz w:val="21"/>
+                <w:sz w:val="20"/>
               </w:rPr>
               <w:t>接口</w:t>
             </w:r>
@@ -8929,7 +8934,7 @@
         </w:tc>
         <w:tc>
           <w:tcPr>
-            <w:tcW w:type="dxa" w:w="1700"/>
+            <w:tcW w:type="dxa" w:w="1512"/>
             <w:vAlign w:val="center"/>
             <w:shd w:fill="F2F2F2"/>
           </w:tcPr>
@@ -8938,12 +8943,17 @@
               <w:spacing w:before="0" w:after="0" w:line="240" w:lineRule="auto"/>
               <w:jc w:val="center"/>
             </w:pPr>
-            <w:r/>
+            <w:r>
+              <w:rPr>
+                <w:rFonts w:ascii="Times New Roman" w:hAnsi="Times New Roman" w:eastAsia="宋体"/>
+                <w:sz w:val="20"/>
+              </w:rPr>
+            </w:r>
             <w:r>
               <w:rPr>
                 <w:rFonts w:ascii="Times New Roman" w:hAnsi="Times New Roman" w:eastAsia="宋体"/>
                 <w:b/>
-                <w:sz w:val="21"/>
+                <w:sz w:val="20"/>
               </w:rPr>
               <w:t>样本数</w:t>
             </w:r>
@@ -8951,7 +8961,7 @@
         </w:tc>
         <w:tc>
           <w:tcPr>
-            <w:tcW w:type="dxa" w:w="1700"/>
+            <w:tcW w:type="dxa" w:w="1440"/>
             <w:vAlign w:val="center"/>
             <w:shd w:fill="F2F2F2"/>
           </w:tcPr>
@@ -8960,12 +8970,17 @@
               <w:spacing w:before="0" w:after="0" w:line="240" w:lineRule="auto"/>
               <w:jc w:val="center"/>
             </w:pPr>
-            <w:r/>
+            <w:r>
+              <w:rPr>
+                <w:rFonts w:ascii="Times New Roman" w:hAnsi="Times New Roman" w:eastAsia="宋体"/>
+                <w:sz w:val="20"/>
+              </w:rPr>
+            </w:r>
             <w:r>
               <w:rPr>
                 <w:rFonts w:ascii="Times New Roman" w:hAnsi="Times New Roman" w:eastAsia="宋体"/>
                 <w:b/>
-                <w:sz w:val="21"/>
+                <w:sz w:val="20"/>
               </w:rPr>
               <w:t>错误数</w:t>
             </w:r>
@@ -8973,7 +8988,7 @@
         </w:tc>
         <w:tc>
           <w:tcPr>
-            <w:tcW w:type="dxa" w:w="2267"/>
+            <w:tcW w:type="dxa" w:w="2088"/>
             <w:vAlign w:val="center"/>
             <w:shd w:fill="F2F2F2"/>
           </w:tcPr>
@@ -8982,12 +8997,17 @@
               <w:spacing w:before="0" w:after="0" w:line="240" w:lineRule="auto"/>
               <w:jc w:val="center"/>
             </w:pPr>
-            <w:r/>
+            <w:r>
+              <w:rPr>
+                <w:rFonts w:ascii="Times New Roman" w:hAnsi="Times New Roman" w:eastAsia="宋体"/>
+                <w:sz w:val="20"/>
+              </w:rPr>
+            </w:r>
             <w:r>
               <w:rPr>
                 <w:rFonts w:ascii="Times New Roman" w:hAnsi="Times New Roman" w:eastAsia="宋体"/>
                 <w:b/>
-                <w:sz w:val="21"/>
+                <w:sz w:val="20"/>
               </w:rPr>
               <w:t>平均响应时间(ms)</w:t>
             </w:r>
@@ -8995,9 +9015,28 @@
         </w:tc>
       </w:tr>
       <w:tr>
+        <w:trPr/>
         <w:tc>
           <w:tcPr>
-            <w:tcW w:type="dxa" w:w="3401"/>
+            <w:tcW w:type="dxa" w:w="4032"/>
+            <w:vAlign w:val="center"/>
+          </w:tcPr>
+          <w:p>
+            <w:pPr>
+              <w:jc w:val="center"/>
+            </w:pPr>
+            <w:r>
+              <w:rPr>
+                <w:rFonts w:ascii="Times New Roman" w:hAnsi="Times New Roman" w:eastAsia="宋体"/>
+                <w:sz w:val="20"/>
+              </w:rPr>
+              <w:t>login</w:t>
+            </w:r>
+          </w:p>
+        </w:tc>
+        <w:tc>
+          <w:tcPr>
+            <w:tcW w:type="dxa" w:w="1512"/>
             <w:vAlign w:val="center"/>
           </w:tcPr>
           <w:p>
@@ -9005,20 +9044,25 @@
               <w:spacing w:before="0" w:after="0" w:line="240" w:lineRule="auto"/>
               <w:jc w:val="center"/>
             </w:pPr>
-            <w:r/>
+            <w:r>
+              <w:rPr>
+                <w:rFonts w:ascii="Times New Roman" w:hAnsi="Times New Roman" w:eastAsia="宋体"/>
+                <w:sz w:val="20"/>
+              </w:rPr>
+            </w:r>
             <w:r>
               <w:rPr>
                 <w:rFonts w:ascii="Times New Roman" w:hAnsi="Times New Roman" w:eastAsia="宋体"/>
                 <w:b w:val="0"/>
-                <w:sz w:val="21"/>
+                <w:sz w:val="20"/>
               </w:rPr>
-              <w:t>01_login</w:t>
+              <w:t>30</w:t>
             </w:r>
           </w:p>
         </w:tc>
         <w:tc>
           <w:tcPr>
-            <w:tcW w:type="dxa" w:w="1700"/>
+            <w:tcW w:type="dxa" w:w="1440"/>
             <w:vAlign w:val="center"/>
           </w:tcPr>
           <w:p>
@@ -9026,12 +9070,90 @@
               <w:spacing w:before="0" w:after="0" w:line="240" w:lineRule="auto"/>
               <w:jc w:val="center"/>
             </w:pPr>
-            <w:r/>
+            <w:r>
+              <w:rPr>
+                <w:rFonts w:ascii="Times New Roman" w:hAnsi="Times New Roman" w:eastAsia="宋体"/>
+                <w:sz w:val="20"/>
+              </w:rPr>
+            </w:r>
             <w:r>
               <w:rPr>
                 <w:rFonts w:ascii="Times New Roman" w:hAnsi="Times New Roman" w:eastAsia="宋体"/>
                 <w:b w:val="0"/>
-                <w:sz w:val="21"/>
+                <w:sz w:val="20"/>
+              </w:rPr>
+              <w:t>0</w:t>
+            </w:r>
+          </w:p>
+        </w:tc>
+        <w:tc>
+          <w:tcPr>
+            <w:tcW w:type="dxa" w:w="2088"/>
+            <w:vAlign w:val="center"/>
+          </w:tcPr>
+          <w:p>
+            <w:pPr>
+              <w:spacing w:before="0" w:after="0" w:line="240" w:lineRule="auto"/>
+              <w:jc w:val="center"/>
+            </w:pPr>
+            <w:r>
+              <w:rPr>
+                <w:rFonts w:ascii="Times New Roman" w:hAnsi="Times New Roman" w:eastAsia="宋体"/>
+                <w:sz w:val="20"/>
+              </w:rPr>
+            </w:r>
+            <w:r>
+              <w:rPr>
+                <w:rFonts w:ascii="Times New Roman" w:hAnsi="Times New Roman" w:eastAsia="宋体"/>
+                <w:b w:val="0"/>
+                <w:sz w:val="20"/>
+              </w:rPr>
+              <w:t>14.23</w:t>
+            </w:r>
+          </w:p>
+        </w:tc>
+      </w:tr>
+      <w:tr>
+        <w:trPr/>
+        <w:tc>
+          <w:tcPr>
+            <w:tcW w:type="dxa" w:w="4032"/>
+            <w:vAlign w:val="center"/>
+          </w:tcPr>
+          <w:p>
+            <w:pPr>
+              <w:jc w:val="center"/>
+            </w:pPr>
+            <w:r>
+              <w:rPr>
+                <w:rFonts w:ascii="Times New Roman" w:hAnsi="Times New Roman" w:eastAsia="宋体"/>
+                <w:sz w:val="20"/>
+              </w:rPr>
+              <w:t>categories</w:t>
+            </w:r>
+          </w:p>
+        </w:tc>
+        <w:tc>
+          <w:tcPr>
+            <w:tcW w:type="dxa" w:w="1512"/>
+            <w:vAlign w:val="center"/>
+          </w:tcPr>
+          <w:p>
+            <w:pPr>
+              <w:spacing w:before="0" w:after="0" w:line="240" w:lineRule="auto"/>
+              <w:jc w:val="center"/>
+            </w:pPr>
+            <w:r>
+              <w:rPr>
+                <w:rFonts w:ascii="Times New Roman" w:hAnsi="Times New Roman" w:eastAsia="宋体"/>
+                <w:sz w:val="20"/>
+              </w:rPr>
+            </w:r>
+            <w:r>
+              <w:rPr>
+                <w:rFonts w:ascii="Times New Roman" w:hAnsi="Times New Roman" w:eastAsia="宋体"/>
+                <w:b w:val="0"/>
+                <w:sz w:val="20"/>
               </w:rPr>
               <w:t>30</w:t>
             </w:r>
@@ -9039,7 +9161,7 @@
         </w:tc>
         <w:tc>
           <w:tcPr>
-            <w:tcW w:type="dxa" w:w="1700"/>
+            <w:tcW w:type="dxa" w:w="1440"/>
             <w:vAlign w:val="center"/>
           </w:tcPr>
           <w:p>
@@ -9047,12 +9169,17 @@
               <w:spacing w:before="0" w:after="0" w:line="240" w:lineRule="auto"/>
               <w:jc w:val="center"/>
             </w:pPr>
-            <w:r/>
+            <w:r>
+              <w:rPr>
+                <w:rFonts w:ascii="Times New Roman" w:hAnsi="Times New Roman" w:eastAsia="宋体"/>
+                <w:sz w:val="20"/>
+              </w:rPr>
+            </w:r>
             <w:r>
               <w:rPr>
                 <w:rFonts w:ascii="Times New Roman" w:hAnsi="Times New Roman" w:eastAsia="宋体"/>
                 <w:b w:val="0"/>
-                <w:sz w:val="21"/>
+                <w:sz w:val="20"/>
               </w:rPr>
               <w:t>0</w:t>
             </w:r>
@@ -9060,7 +9187,7 @@
         </w:tc>
         <w:tc>
           <w:tcPr>
-            <w:tcW w:type="dxa" w:w="2267"/>
+            <w:tcW w:type="dxa" w:w="2088"/>
             <w:vAlign w:val="center"/>
           </w:tcPr>
           <w:p>
@@ -9068,43 +9195,46 @@
               <w:spacing w:before="0" w:after="0" w:line="240" w:lineRule="auto"/>
               <w:jc w:val="center"/>
             </w:pPr>
-            <w:r/>
+            <w:r>
+              <w:rPr>
+                <w:rFonts w:ascii="Times New Roman" w:hAnsi="Times New Roman" w:eastAsia="宋体"/>
+                <w:sz w:val="20"/>
+              </w:rPr>
+            </w:r>
             <w:r>
               <w:rPr>
                 <w:rFonts w:ascii="Times New Roman" w:hAnsi="Times New Roman" w:eastAsia="宋体"/>
                 <w:b w:val="0"/>
-                <w:sz w:val="21"/>
+                <w:sz w:val="20"/>
               </w:rPr>
-              <w:t>14.23</w:t>
+              <w:t>7.23</w:t>
             </w:r>
           </w:p>
         </w:tc>
       </w:tr>
       <w:tr>
+        <w:trPr/>
         <w:tc>
           <w:tcPr>
-            <w:tcW w:type="dxa" w:w="3401"/>
+            <w:tcW w:type="dxa" w:w="4032"/>
             <w:vAlign w:val="center"/>
           </w:tcPr>
           <w:p>
             <w:pPr>
-              <w:spacing w:before="0" w:after="0" w:line="240" w:lineRule="auto"/>
-              <w:jc w:val="left"/>
+              <w:jc w:val="center"/>
             </w:pPr>
-            <w:r/>
             <w:r>
               <w:rPr>
                 <w:rFonts w:ascii="Times New Roman" w:hAnsi="Times New Roman" w:eastAsia="宋体"/>
-                <w:b w:val="0"/>
-                <w:sz w:val="21"/>
+                <w:sz w:val="20"/>
               </w:rPr>
-              <w:t>02_categories</w:t>
+              <w:t>business_detail</w:t>
             </w:r>
           </w:p>
         </w:tc>
         <w:tc>
           <w:tcPr>
-            <w:tcW w:type="dxa" w:w="1700"/>
+            <w:tcW w:type="dxa" w:w="1512"/>
             <w:vAlign w:val="center"/>
           </w:tcPr>
           <w:p>
@@ -9112,12 +9242,17 @@
               <w:spacing w:before="0" w:after="0" w:line="240" w:lineRule="auto"/>
               <w:jc w:val="center"/>
             </w:pPr>
-            <w:r/>
+            <w:r>
+              <w:rPr>
+                <w:rFonts w:ascii="Times New Roman" w:hAnsi="Times New Roman" w:eastAsia="宋体"/>
+                <w:sz w:val="20"/>
+              </w:rPr>
+            </w:r>
             <w:r>
               <w:rPr>
                 <w:rFonts w:ascii="Times New Roman" w:hAnsi="Times New Roman" w:eastAsia="宋体"/>
                 <w:b w:val="0"/>
-                <w:sz w:val="21"/>
+                <w:sz w:val="20"/>
               </w:rPr>
               <w:t>30</w:t>
             </w:r>
@@ -9125,7 +9260,7 @@
         </w:tc>
         <w:tc>
           <w:tcPr>
-            <w:tcW w:type="dxa" w:w="1700"/>
+            <w:tcW w:type="dxa" w:w="1440"/>
             <w:vAlign w:val="center"/>
           </w:tcPr>
           <w:p>
@@ -9133,12 +9268,17 @@
               <w:spacing w:before="0" w:after="0" w:line="240" w:lineRule="auto"/>
               <w:jc w:val="center"/>
             </w:pPr>
-            <w:r/>
+            <w:r>
+              <w:rPr>
+                <w:rFonts w:ascii="Times New Roman" w:hAnsi="Times New Roman" w:eastAsia="宋体"/>
+                <w:sz w:val="20"/>
+              </w:rPr>
+            </w:r>
             <w:r>
               <w:rPr>
                 <w:rFonts w:ascii="Times New Roman" w:hAnsi="Times New Roman" w:eastAsia="宋体"/>
                 <w:b w:val="0"/>
-                <w:sz w:val="21"/>
+                <w:sz w:val="20"/>
               </w:rPr>
               <w:t>0</w:t>
             </w:r>
@@ -9146,7 +9286,7 @@
         </w:tc>
         <w:tc>
           <w:tcPr>
-            <w:tcW w:type="dxa" w:w="2267"/>
+            <w:tcW w:type="dxa" w:w="2088"/>
             <w:vAlign w:val="center"/>
           </w:tcPr>
           <w:p>
@@ -9154,43 +9294,46 @@
               <w:spacing w:before="0" w:after="0" w:line="240" w:lineRule="auto"/>
               <w:jc w:val="center"/>
             </w:pPr>
-            <w:r/>
+            <w:r>
+              <w:rPr>
+                <w:rFonts w:ascii="Times New Roman" w:hAnsi="Times New Roman" w:eastAsia="宋体"/>
+                <w:sz w:val="20"/>
+              </w:rPr>
+            </w:r>
             <w:r>
               <w:rPr>
                 <w:rFonts w:ascii="Times New Roman" w:hAnsi="Times New Roman" w:eastAsia="宋体"/>
                 <w:b w:val="0"/>
-                <w:sz w:val="21"/>
+                <w:sz w:val="20"/>
               </w:rPr>
-              <w:t>7.23</w:t>
+              <w:t>6.87</w:t>
             </w:r>
           </w:p>
         </w:tc>
       </w:tr>
       <w:tr>
+        <w:trPr/>
         <w:tc>
           <w:tcPr>
-            <w:tcW w:type="dxa" w:w="3401"/>
+            <w:tcW w:type="dxa" w:w="4032"/>
             <w:vAlign w:val="center"/>
           </w:tcPr>
           <w:p>
             <w:pPr>
-              <w:spacing w:before="0" w:after="0" w:line="240" w:lineRule="auto"/>
-              <w:jc w:val="left"/>
+              <w:jc w:val="center"/>
             </w:pPr>
-            <w:r/>
             <w:r>
               <w:rPr>
                 <w:rFonts w:ascii="Times New Roman" w:hAnsi="Times New Roman" w:eastAsia="宋体"/>
-                <w:b w:val="0"/>
-                <w:sz w:val="21"/>
+                <w:sz w:val="20"/>
               </w:rPr>
-              <w:t>03_business_detail</w:t>
+              <w:t>foods</w:t>
             </w:r>
           </w:p>
         </w:tc>
         <w:tc>
           <w:tcPr>
-            <w:tcW w:type="dxa" w:w="1700"/>
+            <w:tcW w:type="dxa" w:w="1512"/>
             <w:vAlign w:val="center"/>
           </w:tcPr>
           <w:p>
@@ -9198,12 +9341,17 @@
               <w:spacing w:before="0" w:after="0" w:line="240" w:lineRule="auto"/>
               <w:jc w:val="center"/>
             </w:pPr>
-            <w:r/>
+            <w:r>
+              <w:rPr>
+                <w:rFonts w:ascii="Times New Roman" w:hAnsi="Times New Roman" w:eastAsia="宋体"/>
+                <w:sz w:val="20"/>
+              </w:rPr>
+            </w:r>
             <w:r>
               <w:rPr>
                 <w:rFonts w:ascii="Times New Roman" w:hAnsi="Times New Roman" w:eastAsia="宋体"/>
                 <w:b w:val="0"/>
-                <w:sz w:val="21"/>
+                <w:sz w:val="20"/>
               </w:rPr>
               <w:t>30</w:t>
             </w:r>
@@ -9211,7 +9359,7 @@
         </w:tc>
         <w:tc>
           <w:tcPr>
-            <w:tcW w:type="dxa" w:w="1700"/>
+            <w:tcW w:type="dxa" w:w="1440"/>
             <w:vAlign w:val="center"/>
           </w:tcPr>
           <w:p>
@@ -9219,12 +9367,17 @@
               <w:spacing w:before="0" w:after="0" w:line="240" w:lineRule="auto"/>
               <w:jc w:val="center"/>
             </w:pPr>
-            <w:r/>
+            <w:r>
+              <w:rPr>
+                <w:rFonts w:ascii="Times New Roman" w:hAnsi="Times New Roman" w:eastAsia="宋体"/>
+                <w:sz w:val="20"/>
+              </w:rPr>
+            </w:r>
             <w:r>
               <w:rPr>
                 <w:rFonts w:ascii="Times New Roman" w:hAnsi="Times New Roman" w:eastAsia="宋体"/>
                 <w:b w:val="0"/>
-                <w:sz w:val="21"/>
+                <w:sz w:val="20"/>
               </w:rPr>
               <w:t>0</w:t>
             </w:r>
@@ -9232,7 +9385,7 @@
         </w:tc>
         <w:tc>
           <w:tcPr>
-            <w:tcW w:type="dxa" w:w="2267"/>
+            <w:tcW w:type="dxa" w:w="2088"/>
             <w:vAlign w:val="center"/>
           </w:tcPr>
           <w:p>
@@ -9240,22 +9393,46 @@
               <w:spacing w:before="0" w:after="0" w:line="240" w:lineRule="auto"/>
               <w:jc w:val="center"/>
             </w:pPr>
-            <w:r/>
+            <w:r>
+              <w:rPr>
+                <w:rFonts w:ascii="Times New Roman" w:hAnsi="Times New Roman" w:eastAsia="宋体"/>
+                <w:sz w:val="20"/>
+              </w:rPr>
+            </w:r>
             <w:r>
               <w:rPr>
                 <w:rFonts w:ascii="Times New Roman" w:hAnsi="Times New Roman" w:eastAsia="宋体"/>
                 <w:b w:val="0"/>
-                <w:sz w:val="21"/>
+                <w:sz w:val="20"/>
               </w:rPr>
-              <w:t>6.87</w:t>
+              <w:t>7.03</w:t>
             </w:r>
           </w:p>
         </w:tc>
       </w:tr>
       <w:tr>
+        <w:trPr/>
         <w:tc>
           <w:tcPr>
-            <w:tcW w:type="dxa" w:w="3401"/>
+            <w:tcW w:type="dxa" w:w="4032"/>
+            <w:vAlign w:val="center"/>
+          </w:tcPr>
+          <w:p>
+            <w:pPr>
+              <w:jc w:val="center"/>
+            </w:pPr>
+            <w:r>
+              <w:rPr>
+                <w:rFonts w:ascii="Times New Roman" w:hAnsi="Times New Roman" w:eastAsia="宋体"/>
+                <w:sz w:val="20"/>
+              </w:rPr>
+              <w:t>cart_query</w:t>
+            </w:r>
+          </w:p>
+        </w:tc>
+        <w:tc>
+          <w:tcPr>
+            <w:tcW w:type="dxa" w:w="1512"/>
             <w:vAlign w:val="center"/>
           </w:tcPr>
           <w:p>
@@ -9263,20 +9440,25 @@
               <w:spacing w:before="0" w:after="0" w:line="240" w:lineRule="auto"/>
               <w:jc w:val="center"/>
             </w:pPr>
-            <w:r/>
+            <w:r>
+              <w:rPr>
+                <w:rFonts w:ascii="Times New Roman" w:hAnsi="Times New Roman" w:eastAsia="宋体"/>
+                <w:sz w:val="20"/>
+              </w:rPr>
+            </w:r>
             <w:r>
               <w:rPr>
                 <w:rFonts w:ascii="Times New Roman" w:hAnsi="Times New Roman" w:eastAsia="宋体"/>
                 <w:b w:val="0"/>
-                <w:sz w:val="21"/>
+                <w:sz w:val="20"/>
               </w:rPr>
-              <w:t>04_foods</w:t>
+              <w:t>30</w:t>
             </w:r>
           </w:p>
         </w:tc>
         <w:tc>
           <w:tcPr>
-            <w:tcW w:type="dxa" w:w="1700"/>
+            <w:tcW w:type="dxa" w:w="1440"/>
             <w:vAlign w:val="center"/>
           </w:tcPr>
           <w:p>
@@ -9284,12 +9466,90 @@
               <w:spacing w:before="0" w:after="0" w:line="240" w:lineRule="auto"/>
               <w:jc w:val="center"/>
             </w:pPr>
-            <w:r/>
+            <w:r>
+              <w:rPr>
+                <w:rFonts w:ascii="Times New Roman" w:hAnsi="Times New Roman" w:eastAsia="宋体"/>
+                <w:sz w:val="20"/>
+              </w:rPr>
+            </w:r>
             <w:r>
               <w:rPr>
                 <w:rFonts w:ascii="Times New Roman" w:hAnsi="Times New Roman" w:eastAsia="宋体"/>
                 <w:b w:val="0"/>
-                <w:sz w:val="21"/>
+                <w:sz w:val="20"/>
+              </w:rPr>
+              <w:t>0</w:t>
+            </w:r>
+          </w:p>
+        </w:tc>
+        <w:tc>
+          <w:tcPr>
+            <w:tcW w:type="dxa" w:w="2088"/>
+            <w:vAlign w:val="center"/>
+          </w:tcPr>
+          <w:p>
+            <w:pPr>
+              <w:spacing w:before="0" w:after="0" w:line="240" w:lineRule="auto"/>
+              <w:jc w:val="center"/>
+            </w:pPr>
+            <w:r>
+              <w:rPr>
+                <w:rFonts w:ascii="Times New Roman" w:hAnsi="Times New Roman" w:eastAsia="宋体"/>
+                <w:sz w:val="20"/>
+              </w:rPr>
+            </w:r>
+            <w:r>
+              <w:rPr>
+                <w:rFonts w:ascii="Times New Roman" w:hAnsi="Times New Roman" w:eastAsia="宋体"/>
+                <w:b w:val="0"/>
+                <w:sz w:val="20"/>
+              </w:rPr>
+              <w:t>12.30</w:t>
+            </w:r>
+          </w:p>
+        </w:tc>
+      </w:tr>
+      <w:tr>
+        <w:trPr/>
+        <w:tc>
+          <w:tcPr>
+            <w:tcW w:type="dxa" w:w="4032"/>
+            <w:vAlign w:val="center"/>
+          </w:tcPr>
+          <w:p>
+            <w:pPr>
+              <w:jc w:val="center"/>
+            </w:pPr>
+            <w:r>
+              <w:rPr>
+                <w:rFonts w:ascii="Times New Roman" w:hAnsi="Times New Roman" w:eastAsia="宋体"/>
+                <w:sz w:val="20"/>
+              </w:rPr>
+              <w:t>address_query</w:t>
+            </w:r>
+          </w:p>
+        </w:tc>
+        <w:tc>
+          <w:tcPr>
+            <w:tcW w:type="dxa" w:w="1512"/>
+            <w:vAlign w:val="center"/>
+          </w:tcPr>
+          <w:p>
+            <w:pPr>
+              <w:spacing w:before="0" w:after="0" w:line="240" w:lineRule="auto"/>
+              <w:jc w:val="center"/>
+            </w:pPr>
+            <w:r>
+              <w:rPr>
+                <w:rFonts w:ascii="Times New Roman" w:hAnsi="Times New Roman" w:eastAsia="宋体"/>
+                <w:sz w:val="20"/>
+              </w:rPr>
+            </w:r>
+            <w:r>
+              <w:rPr>
+                <w:rFonts w:ascii="Times New Roman" w:hAnsi="Times New Roman" w:eastAsia="宋体"/>
+                <w:b w:val="0"/>
+                <w:sz w:val="20"/>
               </w:rPr>
               <w:t>30</w:t>
             </w:r>
@@ -9297,7 +9557,7 @@
         </w:tc>
         <w:tc>
           <w:tcPr>
-            <w:tcW w:type="dxa" w:w="1700"/>
+            <w:tcW w:type="dxa" w:w="1440"/>
             <w:vAlign w:val="center"/>
           </w:tcPr>
           <w:p>
@@ -9305,12 +9565,17 @@
               <w:spacing w:before="0" w:after="0" w:line="240" w:lineRule="auto"/>
               <w:jc w:val="center"/>
             </w:pPr>
-            <w:r/>
+            <w:r>
+              <w:rPr>
+                <w:rFonts w:ascii="Times New Roman" w:hAnsi="Times New Roman" w:eastAsia="宋体"/>
+                <w:sz w:val="20"/>
+              </w:rPr>
+            </w:r>
             <w:r>
               <w:rPr>
                 <w:rFonts w:ascii="Times New Roman" w:hAnsi="Times New Roman" w:eastAsia="宋体"/>
                 <w:b w:val="0"/>
-                <w:sz w:val="21"/>
+                <w:sz w:val="20"/>
               </w:rPr>
               <w:t>0</w:t>
             </w:r>
@@ -9318,7 +9583,7 @@
         </w:tc>
         <w:tc>
           <w:tcPr>
-            <w:tcW w:type="dxa" w:w="2267"/>
+            <w:tcW w:type="dxa" w:w="2088"/>
             <w:vAlign w:val="center"/>
           </w:tcPr>
           <w:p>
@@ -9326,43 +9591,39 @@
               <w:spacing w:before="0" w:after="0" w:line="240" w:lineRule="auto"/>
               <w:jc w:val="center"/>
             </w:pPr>
-            <w:r/>
+            <w:r>
+              <w:rPr>
+                <w:rFonts w:ascii="Times New Roman" w:hAnsi="Times New Roman" w:eastAsia="宋体"/>
+                <w:sz w:val="20"/>
+              </w:rPr>
+            </w:r>
             <w:r>
               <w:rPr>
                 <w:rFonts w:ascii="Times New Roman" w:hAnsi="Times New Roman" w:eastAsia="宋体"/>
                 <w:b w:val="0"/>
-                <w:sz w:val="21"/>
+                <w:sz w:val="20"/>
               </w:rPr>
-              <w:t>7.03</w:t>
+              <w:t>19.07</w:t>
             </w:r>
           </w:p>
         </w:tc>
       </w:tr>
       <w:tr>
+        <w:trPr/>
         <w:tc>
           <w:tcPr>
-            <w:tcW w:type="dxa" w:w="3401"/>
+            <w:tcW w:type="dxa" w:w="4032"/>
             <w:vAlign w:val="center"/>
           </w:tcPr>
           <w:p>
-            <w:pPr>
-              <w:spacing w:before="0" w:after="0" w:line="240" w:lineRule="auto"/>
-              <w:jc w:val="left"/>
-            </w:pPr>
-            <w:r/>
             <w:r>
-              <w:rPr>
-                <w:rFonts w:ascii="Times New Roman" w:hAnsi="Times New Roman" w:eastAsia="宋体"/>
-                <w:b w:val="0"/>
-                <w:sz w:val="21"/>
-              </w:rPr>
-              <w:t>05_cart_query</w:t>
+              <w:t>lb_health</w:t>
             </w:r>
           </w:p>
         </w:tc>
         <w:tc>
           <w:tcPr>
-            <w:tcW w:type="dxa" w:w="1700"/>
+            <w:tcW w:type="dxa" w:w="1512"/>
             <w:vAlign w:val="center"/>
           </w:tcPr>
           <w:p>
@@ -9370,12 +9631,17 @@
               <w:spacing w:before="0" w:after="0" w:line="240" w:lineRule="auto"/>
               <w:jc w:val="center"/>
             </w:pPr>
-            <w:r/>
+            <w:r>
+              <w:rPr>
+                <w:rFonts w:ascii="Times New Roman" w:hAnsi="Times New Roman" w:eastAsia="宋体"/>
+                <w:sz w:val="20"/>
+              </w:rPr>
+            </w:r>
             <w:r>
               <w:rPr>
                 <w:rFonts w:ascii="Times New Roman" w:hAnsi="Times New Roman" w:eastAsia="宋体"/>
                 <w:b w:val="0"/>
-                <w:sz w:val="21"/>
+                <w:sz w:val="20"/>
               </w:rPr>
               <w:t>30</w:t>
             </w:r>
@@ -9383,7 +9649,7 @@
         </w:tc>
         <w:tc>
           <w:tcPr>
-            <w:tcW w:type="dxa" w:w="1700"/>
+            <w:tcW w:type="dxa" w:w="1440"/>
             <w:vAlign w:val="center"/>
           </w:tcPr>
           <w:p>
@@ -9391,12 +9657,17 @@
               <w:spacing w:before="0" w:after="0" w:line="240" w:lineRule="auto"/>
               <w:jc w:val="center"/>
             </w:pPr>
-            <w:r/>
+            <w:r>
+              <w:rPr>
+                <w:rFonts w:ascii="Times New Roman" w:hAnsi="Times New Roman" w:eastAsia="宋体"/>
+                <w:sz w:val="20"/>
+              </w:rPr>
+            </w:r>
             <w:r>
               <w:rPr>
                 <w:rFonts w:ascii="Times New Roman" w:hAnsi="Times New Roman" w:eastAsia="宋体"/>
                 <w:b w:val="0"/>
-                <w:sz w:val="21"/>
+                <w:sz w:val="20"/>
               </w:rPr>
               <w:t>0</w:t>
             </w:r>
@@ -9404,7 +9675,7 @@
         </w:tc>
         <w:tc>
           <w:tcPr>
-            <w:tcW w:type="dxa" w:w="2267"/>
+            <w:tcW w:type="dxa" w:w="2088"/>
             <w:vAlign w:val="center"/>
           </w:tcPr>
           <w:p>
@@ -9412,184 +9683,17 @@
               <w:spacing w:before="0" w:after="0" w:line="240" w:lineRule="auto"/>
               <w:jc w:val="center"/>
             </w:pPr>
-            <w:r/>
+            <w:r>
+              <w:rPr>
+                <w:rFonts w:ascii="Times New Roman" w:hAnsi="Times New Roman" w:eastAsia="宋体"/>
+                <w:sz w:val="20"/>
+              </w:rPr>
+            </w:r>
             <w:r>
               <w:rPr>
                 <w:rFonts w:ascii="Times New Roman" w:hAnsi="Times New Roman" w:eastAsia="宋体"/>
                 <w:b w:val="0"/>
-                <w:sz w:val="21"/>
-              </w:rPr>
-              <w:t>12.30</w:t>
-            </w:r>
-          </w:p>
-        </w:tc>
-      </w:tr>
-      <w:tr>
-        <w:tc>
-          <w:tcPr>
-            <w:tcW w:type="dxa" w:w="3401"/>
-            <w:vAlign w:val="center"/>
-          </w:tcPr>
-          <w:p>
-            <w:pPr>
-              <w:spacing w:before="0" w:after="0" w:line="240" w:lineRule="auto"/>
-              <w:jc w:val="left"/>
-            </w:pPr>
-            <w:r/>
-            <w:r>
-              <w:rPr>
-                <w:rFonts w:ascii="Times New Roman" w:hAnsi="Times New Roman" w:eastAsia="宋体"/>
-                <w:b w:val="0"/>
-                <w:sz w:val="21"/>
-              </w:rPr>
-              <w:t>06_address_query</w:t>
-            </w:r>
-          </w:p>
-        </w:tc>
-        <w:tc>
-          <w:tcPr>
-            <w:tcW w:type="dxa" w:w="1700"/>
-            <w:vAlign w:val="center"/>
-          </w:tcPr>
-          <w:p>
-            <w:pPr>
-              <w:spacing w:before="0" w:after="0" w:line="240" w:lineRule="auto"/>
-              <w:jc w:val="center"/>
-            </w:pPr>
-            <w:r/>
-            <w:r>
-              <w:rPr>
-                <w:rFonts w:ascii="Times New Roman" w:hAnsi="Times New Roman" w:eastAsia="宋体"/>
-                <w:b w:val="0"/>
-                <w:sz w:val="21"/>
-              </w:rPr>
-              <w:t>30</w:t>
-            </w:r>
-          </w:p>
-        </w:tc>
-        <w:tc>
-          <w:tcPr>
-            <w:tcW w:type="dxa" w:w="1700"/>
-            <w:vAlign w:val="center"/>
-          </w:tcPr>
-          <w:p>
-            <w:pPr>
-              <w:spacing w:before="0" w:after="0" w:line="240" w:lineRule="auto"/>
-              <w:jc w:val="center"/>
-            </w:pPr>
-            <w:r/>
-            <w:r>
-              <w:rPr>
-                <w:rFonts w:ascii="Times New Roman" w:hAnsi="Times New Roman" w:eastAsia="宋体"/>
-                <w:b w:val="0"/>
-                <w:sz w:val="21"/>
-              </w:rPr>
-              <w:t>0</w:t>
-            </w:r>
-          </w:p>
-        </w:tc>
-        <w:tc>
-          <w:tcPr>
-            <w:tcW w:type="dxa" w:w="2267"/>
-            <w:vAlign w:val="center"/>
-          </w:tcPr>
-          <w:p>
-            <w:pPr>
-              <w:spacing w:before="0" w:after="0" w:line="240" w:lineRule="auto"/>
-              <w:jc w:val="center"/>
-            </w:pPr>
-            <w:r/>
-            <w:r>
-              <w:rPr>
-                <w:rFonts w:ascii="Times New Roman" w:hAnsi="Times New Roman" w:eastAsia="宋体"/>
-                <w:b w:val="0"/>
-                <w:sz w:val="21"/>
-              </w:rPr>
-              <w:t>19.07</w:t>
-            </w:r>
-          </w:p>
-        </w:tc>
-      </w:tr>
-      <w:tr>
-        <w:tc>
-          <w:tcPr>
-            <w:tcW w:type="dxa" w:w="3401"/>
-            <w:vAlign w:val="center"/>
-          </w:tcPr>
-          <w:p>
-            <w:pPr>
-              <w:spacing w:before="0" w:after="0" w:line="240" w:lineRule="auto"/>
-              <w:jc w:val="left"/>
-            </w:pPr>
-            <w:r/>
-            <w:r>
-              <w:rPr>
-                <w:rFonts w:ascii="Times New Roman" w:hAnsi="Times New Roman" w:eastAsia="宋体"/>
-                <w:b w:val="0"/>
-                <w:sz w:val="21"/>
-              </w:rPr>
-              <w:t>07_loadbalance_health</w:t>
-            </w:r>
-          </w:p>
-        </w:tc>
-        <w:tc>
-          <w:tcPr>
-            <w:tcW w:type="dxa" w:w="1700"/>
-            <w:vAlign w:val="center"/>
-          </w:tcPr>
-          <w:p>
-            <w:pPr>
-              <w:spacing w:before="0" w:after="0" w:line="240" w:lineRule="auto"/>
-              <w:jc w:val="center"/>
-            </w:pPr>
-            <w:r/>
-            <w:r>
-              <w:rPr>
-                <w:rFonts w:ascii="Times New Roman" w:hAnsi="Times New Roman" w:eastAsia="宋体"/>
-                <w:b w:val="0"/>
-                <w:sz w:val="21"/>
-              </w:rPr>
-              <w:t>30</w:t>
-            </w:r>
-          </w:p>
-        </w:tc>
-        <w:tc>
-          <w:tcPr>
-            <w:tcW w:type="dxa" w:w="1700"/>
-            <w:vAlign w:val="center"/>
-          </w:tcPr>
-          <w:p>
-            <w:pPr>
-              <w:spacing w:before="0" w:after="0" w:line="240" w:lineRule="auto"/>
-              <w:jc w:val="center"/>
-            </w:pPr>
-            <w:r/>
-            <w:r>
-              <w:rPr>
-                <w:rFonts w:ascii="Times New Roman" w:hAnsi="Times New Roman" w:eastAsia="宋体"/>
-                <w:b w:val="0"/>
-                <w:sz w:val="21"/>
-              </w:rPr>
-              <w:t>0</w:t>
-            </w:r>
-          </w:p>
-        </w:tc>
-        <w:tc>
-          <w:tcPr>
-            <w:tcW w:type="dxa" w:w="2267"/>
-            <w:vAlign w:val="center"/>
-          </w:tcPr>
-          <w:p>
-            <w:pPr>
-              <w:spacing w:before="0" w:after="0" w:line="240" w:lineRule="auto"/>
-              <w:jc w:val="center"/>
-            </w:pPr>
-            <w:r/>
-            <w:r>
-              <w:rPr>
-                <w:rFonts w:ascii="Times New Roman" w:hAnsi="Times New Roman" w:eastAsia="宋体"/>
-                <w:b w:val="0"/>
-                <w:sz w:val="21"/>
+                <w:sz w:val="20"/>
               </w:rPr>
               <w:t>6.43</w:t>
             </w:r>

</xml_diff>